<commit_message>
Cập nhật tài liệu CSDL
</commit_message>
<xml_diff>
--- a/TaiLieuCSDL.docx
+++ b/TaiLieuCSDL.docx
@@ -10533,16 +10533,32 @@
     <w:p>
       <w:pPr>
         <w:pStyle w:val="Ghichbng"/>
+        <w:rPr>
+          <w:rFonts w:cs="Times New Roman"/>
+          <w:szCs w:val="26"/>
+        </w:rPr>
       </w:pPr>
       <w:r>
+        <w:rPr>
+          <w:rFonts w:cs="Times New Roman"/>
+          <w:szCs w:val="26"/>
+        </w:rPr>
         <w:t xml:space="preserve">Bảng này cho phép Merchant tạo mã giảm giá cho khách hàng. Voucher có thể áp dụng </w:t>
       </w:r>
       <w:proofErr w:type="gramStart"/>
       <w:r>
+        <w:rPr>
+          <w:rFonts w:cs="Times New Roman"/>
+          <w:szCs w:val="26"/>
+        </w:rPr>
         <w:t>chung</w:t>
       </w:r>
       <w:proofErr w:type="gramEnd"/>
       <w:r>
+        <w:rPr>
+          <w:rFonts w:cs="Times New Roman"/>
+          <w:szCs w:val="26"/>
+        </w:rPr>
         <w:t xml:space="preserve"> cho Merchant hoặc gắn với một Reseller đã được duyệt tham gia chiến dịch.</w:t>
       </w:r>
     </w:p>
@@ -11822,10 +11838,24 @@
     <w:p>
       <w:pPr>
         <w:ind w:left="288" w:firstLine="0"/>
+        <w:rPr>
+          <w:rFonts w:cs="Times New Roman"/>
+          <w:szCs w:val="26"/>
+        </w:rPr>
       </w:pPr>
     </w:p>
     <w:p>
+      <w:pPr>
+        <w:rPr>
+          <w:rFonts w:cs="Times New Roman"/>
+          <w:szCs w:val="26"/>
+        </w:rPr>
+      </w:pPr>
       <w:r>
+        <w:rPr>
+          <w:rFonts w:cs="Times New Roman"/>
+          <w:szCs w:val="26"/>
+        </w:rPr>
         <w:t xml:space="preserve">Ràng buộc nên có: </w:t>
       </w:r>
       <w:r>
@@ -11838,6 +11868,10 @@
         <w:t>UNIQUE (merchant_id, code)</w:t>
       </w:r>
       <w:r>
+        <w:rPr>
+          <w:rFonts w:cs="Times New Roman"/>
+          <w:szCs w:val="26"/>
+        </w:rPr>
         <w:t xml:space="preserve"> để mã voucher không bị trùng trong cùng một Merchant. Backend cũng phải xác nhận voucher còn hiệu lực và đáp ứng điều kiện đơn hàng trước khi áp dụng.</w:t>
       </w:r>
     </w:p>
@@ -12648,6 +12682,1044 @@
     <w:p>
       <w:pPr>
         <w:pStyle w:val="Heading2"/>
+      </w:pPr>
+      <w:r>
+        <w:t xml:space="preserve">Thiết kế bảng </w:t>
+      </w:r>
+      <w:r>
+        <w:rPr>
+          <w:rStyle w:val="HTMLCode"/>
+          <w:rFonts w:ascii="Times New Roman" w:eastAsiaTheme="majorEastAsia" w:hAnsi="Times New Roman" w:cs="Times New Roman"/>
+          <w:sz w:val="26"/>
+          <w:szCs w:val="26"/>
+        </w:rPr>
+        <w:t>reseller_campaign_posts</w:t>
+      </w:r>
+    </w:p>
+    <w:tbl>
+      <w:tblPr>
+        <w:tblStyle w:val="TableGrid"/>
+        <w:tblW w:w="0" w:type="auto"/>
+        <w:tblCellMar>
+          <w:top w:w="115" w:type="dxa"/>
+          <w:left w:w="115" w:type="dxa"/>
+          <w:bottom w:w="115" w:type="dxa"/>
+          <w:right w:w="115" w:type="dxa"/>
+        </w:tblCellMar>
+        <w:tblLook w:val="04A0" w:firstRow="1" w:lastRow="0" w:firstColumn="1" w:lastColumn="0" w:noHBand="0" w:noVBand="1"/>
+      </w:tblPr>
+      <w:tblGrid>
+        <w:gridCol w:w="2859"/>
+        <w:gridCol w:w="2050"/>
+        <w:gridCol w:w="4493"/>
+      </w:tblGrid>
+      <w:tr>
+        <w:tc>
+          <w:tcPr>
+            <w:tcW w:w="0" w:type="auto"/>
+            <w:hideMark/>
+          </w:tcPr>
+          <w:p>
+            <w:pPr>
+              <w:pStyle w:val="NormalWeb"/>
+              <w:jc w:val="center"/>
+              <w:rPr>
+                <w:b/>
+                <w:bCs/>
+                <w:sz w:val="26"/>
+                <w:szCs w:val="26"/>
+              </w:rPr>
+            </w:pPr>
+            <w:r>
+              <w:rPr>
+                <w:b/>
+                <w:bCs/>
+                <w:sz w:val="26"/>
+                <w:szCs w:val="26"/>
+              </w:rPr>
+              <w:t>Tên trường</w:t>
+            </w:r>
+          </w:p>
+        </w:tc>
+        <w:tc>
+          <w:tcPr>
+            <w:tcW w:w="0" w:type="auto"/>
+            <w:hideMark/>
+          </w:tcPr>
+          <w:p>
+            <w:pPr>
+              <w:pStyle w:val="NormalWeb"/>
+              <w:jc w:val="center"/>
+              <w:rPr>
+                <w:b/>
+                <w:bCs/>
+                <w:sz w:val="26"/>
+                <w:szCs w:val="26"/>
+              </w:rPr>
+            </w:pPr>
+            <w:r>
+              <w:rPr>
+                <w:b/>
+                <w:bCs/>
+                <w:sz w:val="26"/>
+                <w:szCs w:val="26"/>
+              </w:rPr>
+              <w:t>Kiểu dữ liệu</w:t>
+            </w:r>
+          </w:p>
+        </w:tc>
+        <w:tc>
+          <w:tcPr>
+            <w:tcW w:w="0" w:type="auto"/>
+            <w:hideMark/>
+          </w:tcPr>
+          <w:p>
+            <w:pPr>
+              <w:pStyle w:val="NormalWeb"/>
+              <w:jc w:val="center"/>
+              <w:rPr>
+                <w:b/>
+                <w:bCs/>
+                <w:sz w:val="26"/>
+                <w:szCs w:val="26"/>
+              </w:rPr>
+            </w:pPr>
+            <w:r>
+              <w:rPr>
+                <w:b/>
+                <w:bCs/>
+                <w:sz w:val="26"/>
+                <w:szCs w:val="26"/>
+              </w:rPr>
+              <w:t>Ý nghĩa</w:t>
+            </w:r>
+          </w:p>
+        </w:tc>
+      </w:tr>
+      <w:tr>
+        <w:tc>
+          <w:tcPr>
+            <w:tcW w:w="0" w:type="auto"/>
+            <w:hideMark/>
+          </w:tcPr>
+          <w:p>
+            <w:pPr>
+              <w:pStyle w:val="NormalWeb"/>
+              <w:rPr>
+                <w:sz w:val="26"/>
+                <w:szCs w:val="26"/>
+              </w:rPr>
+            </w:pPr>
+            <w:r>
+              <w:rPr>
+                <w:rStyle w:val="HTMLCode"/>
+                <w:rFonts w:ascii="Times New Roman" w:hAnsi="Times New Roman" w:cs="Times New Roman"/>
+                <w:sz w:val="26"/>
+                <w:szCs w:val="26"/>
+              </w:rPr>
+              <w:t>id</w:t>
+            </w:r>
+          </w:p>
+        </w:tc>
+        <w:tc>
+          <w:tcPr>
+            <w:tcW w:w="0" w:type="auto"/>
+            <w:hideMark/>
+          </w:tcPr>
+          <w:p>
+            <w:pPr>
+              <w:pStyle w:val="NormalWeb"/>
+              <w:rPr>
+                <w:sz w:val="26"/>
+                <w:szCs w:val="26"/>
+              </w:rPr>
+            </w:pPr>
+            <w:r>
+              <w:rPr>
+                <w:sz w:val="26"/>
+                <w:szCs w:val="26"/>
+              </w:rPr>
+              <w:t>UUID</w:t>
+            </w:r>
+          </w:p>
+        </w:tc>
+        <w:tc>
+          <w:tcPr>
+            <w:tcW w:w="0" w:type="auto"/>
+            <w:hideMark/>
+          </w:tcPr>
+          <w:p>
+            <w:pPr>
+              <w:pStyle w:val="NormalWeb"/>
+              <w:rPr>
+                <w:sz w:val="26"/>
+                <w:szCs w:val="26"/>
+              </w:rPr>
+            </w:pPr>
+            <w:r>
+              <w:rPr>
+                <w:sz w:val="26"/>
+                <w:szCs w:val="26"/>
+              </w:rPr>
+              <w:t>Khóa chính của bài đăng.</w:t>
+            </w:r>
+          </w:p>
+        </w:tc>
+      </w:tr>
+      <w:tr>
+        <w:tc>
+          <w:tcPr>
+            <w:tcW w:w="0" w:type="auto"/>
+            <w:hideMark/>
+          </w:tcPr>
+          <w:p>
+            <w:pPr>
+              <w:pStyle w:val="NormalWeb"/>
+              <w:rPr>
+                <w:sz w:val="26"/>
+                <w:szCs w:val="26"/>
+              </w:rPr>
+            </w:pPr>
+            <w:r>
+              <w:rPr>
+                <w:rStyle w:val="HTMLCode"/>
+                <w:rFonts w:ascii="Times New Roman" w:hAnsi="Times New Roman" w:cs="Times New Roman"/>
+                <w:sz w:val="26"/>
+                <w:szCs w:val="26"/>
+              </w:rPr>
+              <w:t>campaign_application_id</w:t>
+            </w:r>
+          </w:p>
+        </w:tc>
+        <w:tc>
+          <w:tcPr>
+            <w:tcW w:w="0" w:type="auto"/>
+            <w:hideMark/>
+          </w:tcPr>
+          <w:p>
+            <w:pPr>
+              <w:pStyle w:val="NormalWeb"/>
+              <w:rPr>
+                <w:sz w:val="26"/>
+                <w:szCs w:val="26"/>
+              </w:rPr>
+            </w:pPr>
+            <w:r>
+              <w:rPr>
+                <w:sz w:val="26"/>
+                <w:szCs w:val="26"/>
+              </w:rPr>
+              <w:t>UUID</w:t>
+            </w:r>
+          </w:p>
+        </w:tc>
+        <w:tc>
+          <w:tcPr>
+            <w:tcW w:w="0" w:type="auto"/>
+            <w:hideMark/>
+          </w:tcPr>
+          <w:p>
+            <w:pPr>
+              <w:pStyle w:val="NormalWeb"/>
+              <w:rPr>
+                <w:sz w:val="26"/>
+                <w:szCs w:val="26"/>
+              </w:rPr>
+            </w:pPr>
+            <w:r>
+              <w:rPr>
+                <w:sz w:val="26"/>
+                <w:szCs w:val="26"/>
+              </w:rPr>
+              <w:t>Chiến dịch mà reseller đã đăng ký tham gia.</w:t>
+            </w:r>
+          </w:p>
+        </w:tc>
+      </w:tr>
+      <w:tr>
+        <w:tc>
+          <w:tcPr>
+            <w:tcW w:w="0" w:type="auto"/>
+            <w:hideMark/>
+          </w:tcPr>
+          <w:p>
+            <w:pPr>
+              <w:pStyle w:val="NormalWeb"/>
+              <w:rPr>
+                <w:sz w:val="26"/>
+                <w:szCs w:val="26"/>
+              </w:rPr>
+            </w:pPr>
+            <w:r>
+              <w:rPr>
+                <w:rStyle w:val="HTMLCode"/>
+                <w:rFonts w:ascii="Times New Roman" w:hAnsi="Times New Roman" w:cs="Times New Roman"/>
+                <w:sz w:val="26"/>
+                <w:szCs w:val="26"/>
+              </w:rPr>
+              <w:t>social_account_id</w:t>
+            </w:r>
+          </w:p>
+        </w:tc>
+        <w:tc>
+          <w:tcPr>
+            <w:tcW w:w="0" w:type="auto"/>
+            <w:hideMark/>
+          </w:tcPr>
+          <w:p>
+            <w:pPr>
+              <w:pStyle w:val="NormalWeb"/>
+              <w:rPr>
+                <w:sz w:val="26"/>
+                <w:szCs w:val="26"/>
+              </w:rPr>
+            </w:pPr>
+            <w:r>
+              <w:rPr>
+                <w:sz w:val="26"/>
+                <w:szCs w:val="26"/>
+              </w:rPr>
+              <w:t>UUID</w:t>
+            </w:r>
+          </w:p>
+        </w:tc>
+        <w:tc>
+          <w:tcPr>
+            <w:tcW w:w="0" w:type="auto"/>
+            <w:hideMark/>
+          </w:tcPr>
+          <w:p>
+            <w:pPr>
+              <w:pStyle w:val="NormalWeb"/>
+              <w:rPr>
+                <w:sz w:val="26"/>
+                <w:szCs w:val="26"/>
+              </w:rPr>
+            </w:pPr>
+            <w:r>
+              <w:rPr>
+                <w:sz w:val="26"/>
+                <w:szCs w:val="26"/>
+              </w:rPr>
+              <w:t>Tài khoản mạng xã hội dùng để đăng video.</w:t>
+            </w:r>
+          </w:p>
+        </w:tc>
+      </w:tr>
+      <w:tr>
+        <w:tc>
+          <w:tcPr>
+            <w:tcW w:w="0" w:type="auto"/>
+            <w:hideMark/>
+          </w:tcPr>
+          <w:p>
+            <w:pPr>
+              <w:pStyle w:val="NormalWeb"/>
+              <w:rPr>
+                <w:sz w:val="26"/>
+                <w:szCs w:val="26"/>
+              </w:rPr>
+            </w:pPr>
+            <w:r>
+              <w:rPr>
+                <w:rStyle w:val="HTMLCode"/>
+                <w:rFonts w:ascii="Times New Roman" w:hAnsi="Times New Roman" w:cs="Times New Roman"/>
+                <w:sz w:val="26"/>
+                <w:szCs w:val="26"/>
+              </w:rPr>
+              <w:t>post_url</w:t>
+            </w:r>
+          </w:p>
+        </w:tc>
+        <w:tc>
+          <w:tcPr>
+            <w:tcW w:w="0" w:type="auto"/>
+            <w:hideMark/>
+          </w:tcPr>
+          <w:p>
+            <w:pPr>
+              <w:pStyle w:val="NormalWeb"/>
+              <w:rPr>
+                <w:sz w:val="26"/>
+                <w:szCs w:val="26"/>
+              </w:rPr>
+            </w:pPr>
+            <w:r>
+              <w:rPr>
+                <w:sz w:val="26"/>
+                <w:szCs w:val="26"/>
+              </w:rPr>
+              <w:t>TEXT</w:t>
+            </w:r>
+          </w:p>
+        </w:tc>
+        <w:tc>
+          <w:tcPr>
+            <w:tcW w:w="0" w:type="auto"/>
+            <w:hideMark/>
+          </w:tcPr>
+          <w:p>
+            <w:pPr>
+              <w:pStyle w:val="NormalWeb"/>
+              <w:rPr>
+                <w:sz w:val="26"/>
+                <w:szCs w:val="26"/>
+              </w:rPr>
+            </w:pPr>
+            <w:r>
+              <w:rPr>
+                <w:sz w:val="26"/>
+                <w:szCs w:val="26"/>
+              </w:rPr>
+              <w:t>Đường dẫn video đã đăng lên mạng xã hội.</w:t>
+            </w:r>
+          </w:p>
+        </w:tc>
+      </w:tr>
+      <w:tr>
+        <w:tc>
+          <w:tcPr>
+            <w:tcW w:w="0" w:type="auto"/>
+            <w:hideMark/>
+          </w:tcPr>
+          <w:p>
+            <w:pPr>
+              <w:pStyle w:val="NormalWeb"/>
+              <w:rPr>
+                <w:sz w:val="26"/>
+                <w:szCs w:val="26"/>
+              </w:rPr>
+            </w:pPr>
+            <w:bookmarkStart w:id="0" w:name="_GoBack"/>
+            <w:bookmarkEnd w:id="0"/>
+            <w:r>
+              <w:rPr>
+                <w:rStyle w:val="HTMLCode"/>
+                <w:rFonts w:ascii="Times New Roman" w:hAnsi="Times New Roman" w:cs="Times New Roman"/>
+                <w:sz w:val="26"/>
+                <w:szCs w:val="26"/>
+              </w:rPr>
+              <w:t>caption</w:t>
+            </w:r>
+          </w:p>
+        </w:tc>
+        <w:tc>
+          <w:tcPr>
+            <w:tcW w:w="0" w:type="auto"/>
+            <w:hideMark/>
+          </w:tcPr>
+          <w:p>
+            <w:pPr>
+              <w:pStyle w:val="NormalWeb"/>
+              <w:rPr>
+                <w:sz w:val="26"/>
+                <w:szCs w:val="26"/>
+              </w:rPr>
+            </w:pPr>
+            <w:r>
+              <w:rPr>
+                <w:sz w:val="26"/>
+                <w:szCs w:val="26"/>
+              </w:rPr>
+              <w:t>TEXT</w:t>
+            </w:r>
+          </w:p>
+        </w:tc>
+        <w:tc>
+          <w:tcPr>
+            <w:tcW w:w="0" w:type="auto"/>
+            <w:hideMark/>
+          </w:tcPr>
+          <w:p>
+            <w:pPr>
+              <w:pStyle w:val="NormalWeb"/>
+              <w:rPr>
+                <w:sz w:val="26"/>
+                <w:szCs w:val="26"/>
+              </w:rPr>
+            </w:pPr>
+            <w:r>
+              <w:rPr>
+                <w:sz w:val="26"/>
+                <w:szCs w:val="26"/>
+              </w:rPr>
+              <w:t>Nội dung mô tả đi kèm video.</w:t>
+            </w:r>
+          </w:p>
+        </w:tc>
+      </w:tr>
+      <w:tr>
+        <w:tc>
+          <w:tcPr>
+            <w:tcW w:w="0" w:type="auto"/>
+            <w:hideMark/>
+          </w:tcPr>
+          <w:p>
+            <w:pPr>
+              <w:pStyle w:val="NormalWeb"/>
+              <w:rPr>
+                <w:sz w:val="26"/>
+                <w:szCs w:val="26"/>
+              </w:rPr>
+            </w:pPr>
+            <w:r>
+              <w:rPr>
+                <w:rStyle w:val="HTMLCode"/>
+                <w:rFonts w:ascii="Times New Roman" w:hAnsi="Times New Roman" w:cs="Times New Roman"/>
+                <w:sz w:val="26"/>
+                <w:szCs w:val="26"/>
+              </w:rPr>
+              <w:t>views_count</w:t>
+            </w:r>
+          </w:p>
+        </w:tc>
+        <w:tc>
+          <w:tcPr>
+            <w:tcW w:w="0" w:type="auto"/>
+            <w:hideMark/>
+          </w:tcPr>
+          <w:p>
+            <w:pPr>
+              <w:pStyle w:val="NormalWeb"/>
+              <w:rPr>
+                <w:sz w:val="26"/>
+                <w:szCs w:val="26"/>
+              </w:rPr>
+            </w:pPr>
+            <w:r>
+              <w:rPr>
+                <w:sz w:val="26"/>
+                <w:szCs w:val="26"/>
+              </w:rPr>
+              <w:t>BIGINT</w:t>
+            </w:r>
+          </w:p>
+        </w:tc>
+        <w:tc>
+          <w:tcPr>
+            <w:tcW w:w="0" w:type="auto"/>
+            <w:hideMark/>
+          </w:tcPr>
+          <w:p>
+            <w:pPr>
+              <w:pStyle w:val="NormalWeb"/>
+              <w:rPr>
+                <w:sz w:val="26"/>
+                <w:szCs w:val="26"/>
+              </w:rPr>
+            </w:pPr>
+            <w:r>
+              <w:rPr>
+                <w:sz w:val="26"/>
+                <w:szCs w:val="26"/>
+              </w:rPr>
+              <w:t>Tổng lượt xem mới nhất của video.</w:t>
+            </w:r>
+          </w:p>
+        </w:tc>
+      </w:tr>
+      <w:tr>
+        <w:tc>
+          <w:tcPr>
+            <w:tcW w:w="0" w:type="auto"/>
+            <w:hideMark/>
+          </w:tcPr>
+          <w:p>
+            <w:pPr>
+              <w:pStyle w:val="NormalWeb"/>
+              <w:rPr>
+                <w:sz w:val="26"/>
+                <w:szCs w:val="26"/>
+              </w:rPr>
+            </w:pPr>
+            <w:r>
+              <w:rPr>
+                <w:rStyle w:val="HTMLCode"/>
+                <w:rFonts w:ascii="Times New Roman" w:hAnsi="Times New Roman" w:cs="Times New Roman"/>
+                <w:sz w:val="26"/>
+                <w:szCs w:val="26"/>
+              </w:rPr>
+              <w:t>likes_count</w:t>
+            </w:r>
+          </w:p>
+        </w:tc>
+        <w:tc>
+          <w:tcPr>
+            <w:tcW w:w="0" w:type="auto"/>
+            <w:hideMark/>
+          </w:tcPr>
+          <w:p>
+            <w:pPr>
+              <w:pStyle w:val="NormalWeb"/>
+              <w:rPr>
+                <w:sz w:val="26"/>
+                <w:szCs w:val="26"/>
+              </w:rPr>
+            </w:pPr>
+            <w:r>
+              <w:rPr>
+                <w:sz w:val="26"/>
+                <w:szCs w:val="26"/>
+              </w:rPr>
+              <w:t>BIGINT</w:t>
+            </w:r>
+          </w:p>
+        </w:tc>
+        <w:tc>
+          <w:tcPr>
+            <w:tcW w:w="0" w:type="auto"/>
+            <w:hideMark/>
+          </w:tcPr>
+          <w:p>
+            <w:pPr>
+              <w:pStyle w:val="NormalWeb"/>
+              <w:rPr>
+                <w:sz w:val="26"/>
+                <w:szCs w:val="26"/>
+              </w:rPr>
+            </w:pPr>
+            <w:r>
+              <w:rPr>
+                <w:sz w:val="26"/>
+                <w:szCs w:val="26"/>
+              </w:rPr>
+              <w:t>Tổng lượt thích mới nhất.</w:t>
+            </w:r>
+          </w:p>
+        </w:tc>
+      </w:tr>
+      <w:tr>
+        <w:tc>
+          <w:tcPr>
+            <w:tcW w:w="0" w:type="auto"/>
+            <w:hideMark/>
+          </w:tcPr>
+          <w:p>
+            <w:pPr>
+              <w:pStyle w:val="NormalWeb"/>
+              <w:rPr>
+                <w:sz w:val="26"/>
+                <w:szCs w:val="26"/>
+              </w:rPr>
+            </w:pPr>
+            <w:r>
+              <w:rPr>
+                <w:rStyle w:val="HTMLCode"/>
+                <w:rFonts w:ascii="Times New Roman" w:hAnsi="Times New Roman" w:cs="Times New Roman"/>
+                <w:sz w:val="26"/>
+                <w:szCs w:val="26"/>
+              </w:rPr>
+              <w:t>comments_count</w:t>
+            </w:r>
+          </w:p>
+        </w:tc>
+        <w:tc>
+          <w:tcPr>
+            <w:tcW w:w="0" w:type="auto"/>
+            <w:hideMark/>
+          </w:tcPr>
+          <w:p>
+            <w:pPr>
+              <w:pStyle w:val="NormalWeb"/>
+              <w:rPr>
+                <w:sz w:val="26"/>
+                <w:szCs w:val="26"/>
+              </w:rPr>
+            </w:pPr>
+            <w:r>
+              <w:rPr>
+                <w:sz w:val="26"/>
+                <w:szCs w:val="26"/>
+              </w:rPr>
+              <w:t>BIGINT</w:t>
+            </w:r>
+          </w:p>
+        </w:tc>
+        <w:tc>
+          <w:tcPr>
+            <w:tcW w:w="0" w:type="auto"/>
+            <w:hideMark/>
+          </w:tcPr>
+          <w:p>
+            <w:pPr>
+              <w:pStyle w:val="NormalWeb"/>
+              <w:rPr>
+                <w:sz w:val="26"/>
+                <w:szCs w:val="26"/>
+              </w:rPr>
+            </w:pPr>
+            <w:r>
+              <w:rPr>
+                <w:sz w:val="26"/>
+                <w:szCs w:val="26"/>
+              </w:rPr>
+              <w:t>Tổng lượt bình luận mới nhất.</w:t>
+            </w:r>
+          </w:p>
+        </w:tc>
+      </w:tr>
+      <w:tr>
+        <w:tc>
+          <w:tcPr>
+            <w:tcW w:w="0" w:type="auto"/>
+            <w:hideMark/>
+          </w:tcPr>
+          <w:p>
+            <w:pPr>
+              <w:pStyle w:val="NormalWeb"/>
+              <w:rPr>
+                <w:sz w:val="26"/>
+                <w:szCs w:val="26"/>
+              </w:rPr>
+            </w:pPr>
+            <w:r>
+              <w:rPr>
+                <w:rStyle w:val="HTMLCode"/>
+                <w:rFonts w:ascii="Times New Roman" w:hAnsi="Times New Roman" w:cs="Times New Roman"/>
+                <w:sz w:val="26"/>
+                <w:szCs w:val="26"/>
+              </w:rPr>
+              <w:t>shares_count</w:t>
+            </w:r>
+          </w:p>
+        </w:tc>
+        <w:tc>
+          <w:tcPr>
+            <w:tcW w:w="0" w:type="auto"/>
+            <w:hideMark/>
+          </w:tcPr>
+          <w:p>
+            <w:pPr>
+              <w:pStyle w:val="NormalWeb"/>
+              <w:rPr>
+                <w:sz w:val="26"/>
+                <w:szCs w:val="26"/>
+              </w:rPr>
+            </w:pPr>
+            <w:r>
+              <w:rPr>
+                <w:sz w:val="26"/>
+                <w:szCs w:val="26"/>
+              </w:rPr>
+              <w:t>BIGINT</w:t>
+            </w:r>
+          </w:p>
+        </w:tc>
+        <w:tc>
+          <w:tcPr>
+            <w:tcW w:w="0" w:type="auto"/>
+            <w:hideMark/>
+          </w:tcPr>
+          <w:p>
+            <w:pPr>
+              <w:pStyle w:val="NormalWeb"/>
+              <w:rPr>
+                <w:sz w:val="26"/>
+                <w:szCs w:val="26"/>
+              </w:rPr>
+            </w:pPr>
+            <w:r>
+              <w:rPr>
+                <w:sz w:val="26"/>
+                <w:szCs w:val="26"/>
+              </w:rPr>
+              <w:t>Tổng lượt chia sẻ mới nhất.</w:t>
+            </w:r>
+          </w:p>
+        </w:tc>
+      </w:tr>
+      <w:tr>
+        <w:tc>
+          <w:tcPr>
+            <w:tcW w:w="0" w:type="auto"/>
+            <w:hideMark/>
+          </w:tcPr>
+          <w:p>
+            <w:pPr>
+              <w:pStyle w:val="NormalWeb"/>
+              <w:rPr>
+                <w:sz w:val="26"/>
+                <w:szCs w:val="26"/>
+              </w:rPr>
+            </w:pPr>
+            <w:r>
+              <w:rPr>
+                <w:rStyle w:val="HTMLCode"/>
+                <w:rFonts w:ascii="Times New Roman" w:hAnsi="Times New Roman" w:cs="Times New Roman"/>
+                <w:sz w:val="26"/>
+                <w:szCs w:val="26"/>
+              </w:rPr>
+              <w:t>published_at</w:t>
+            </w:r>
+          </w:p>
+        </w:tc>
+        <w:tc>
+          <w:tcPr>
+            <w:tcW w:w="0" w:type="auto"/>
+            <w:hideMark/>
+          </w:tcPr>
+          <w:p>
+            <w:pPr>
+              <w:pStyle w:val="NormalWeb"/>
+              <w:rPr>
+                <w:sz w:val="26"/>
+                <w:szCs w:val="26"/>
+              </w:rPr>
+            </w:pPr>
+            <w:r>
+              <w:rPr>
+                <w:sz w:val="26"/>
+                <w:szCs w:val="26"/>
+              </w:rPr>
+              <w:t>TIMESTAMPTZ</w:t>
+            </w:r>
+          </w:p>
+        </w:tc>
+        <w:tc>
+          <w:tcPr>
+            <w:tcW w:w="0" w:type="auto"/>
+            <w:hideMark/>
+          </w:tcPr>
+          <w:p>
+            <w:pPr>
+              <w:pStyle w:val="NormalWeb"/>
+              <w:rPr>
+                <w:sz w:val="26"/>
+                <w:szCs w:val="26"/>
+              </w:rPr>
+            </w:pPr>
+            <w:r>
+              <w:rPr>
+                <w:sz w:val="26"/>
+                <w:szCs w:val="26"/>
+              </w:rPr>
+              <w:t>Thời điểm đăng video.</w:t>
+            </w:r>
+          </w:p>
+        </w:tc>
+      </w:tr>
+      <w:tr>
+        <w:tc>
+          <w:tcPr>
+            <w:tcW w:w="0" w:type="auto"/>
+            <w:hideMark/>
+          </w:tcPr>
+          <w:p>
+            <w:pPr>
+              <w:pStyle w:val="NormalWeb"/>
+              <w:rPr>
+                <w:sz w:val="26"/>
+                <w:szCs w:val="26"/>
+              </w:rPr>
+            </w:pPr>
+            <w:r>
+              <w:rPr>
+                <w:rStyle w:val="HTMLCode"/>
+                <w:rFonts w:ascii="Times New Roman" w:hAnsi="Times New Roman" w:cs="Times New Roman"/>
+                <w:sz w:val="26"/>
+                <w:szCs w:val="26"/>
+              </w:rPr>
+              <w:t>status</w:t>
+            </w:r>
+          </w:p>
+        </w:tc>
+        <w:tc>
+          <w:tcPr>
+            <w:tcW w:w="0" w:type="auto"/>
+            <w:hideMark/>
+          </w:tcPr>
+          <w:p>
+            <w:pPr>
+              <w:pStyle w:val="NormalWeb"/>
+              <w:rPr>
+                <w:sz w:val="26"/>
+                <w:szCs w:val="26"/>
+              </w:rPr>
+            </w:pPr>
+            <w:r>
+              <w:rPr>
+                <w:sz w:val="26"/>
+                <w:szCs w:val="26"/>
+              </w:rPr>
+              <w:t>VARCHAR(20)</w:t>
+            </w:r>
+          </w:p>
+        </w:tc>
+        <w:tc>
+          <w:tcPr>
+            <w:tcW w:w="0" w:type="auto"/>
+            <w:hideMark/>
+          </w:tcPr>
+          <w:p>
+            <w:pPr>
+              <w:pStyle w:val="NormalWeb"/>
+              <w:rPr>
+                <w:sz w:val="26"/>
+                <w:szCs w:val="26"/>
+              </w:rPr>
+            </w:pPr>
+            <w:r>
+              <w:rPr>
+                <w:sz w:val="26"/>
+                <w:szCs w:val="26"/>
+              </w:rPr>
+              <w:t>Trạng thái bài đăng.</w:t>
+            </w:r>
+          </w:p>
+        </w:tc>
+      </w:tr>
+      <w:tr>
+        <w:tc>
+          <w:tcPr>
+            <w:tcW w:w="0" w:type="auto"/>
+            <w:hideMark/>
+          </w:tcPr>
+          <w:p>
+            <w:pPr>
+              <w:pStyle w:val="NormalWeb"/>
+              <w:rPr>
+                <w:sz w:val="26"/>
+                <w:szCs w:val="26"/>
+              </w:rPr>
+            </w:pPr>
+            <w:r>
+              <w:rPr>
+                <w:rStyle w:val="HTMLCode"/>
+                <w:rFonts w:ascii="Times New Roman" w:hAnsi="Times New Roman" w:cs="Times New Roman"/>
+                <w:sz w:val="26"/>
+                <w:szCs w:val="26"/>
+              </w:rPr>
+              <w:t>created_at</w:t>
+            </w:r>
+          </w:p>
+        </w:tc>
+        <w:tc>
+          <w:tcPr>
+            <w:tcW w:w="0" w:type="auto"/>
+            <w:hideMark/>
+          </w:tcPr>
+          <w:p>
+            <w:pPr>
+              <w:pStyle w:val="NormalWeb"/>
+              <w:rPr>
+                <w:sz w:val="26"/>
+                <w:szCs w:val="26"/>
+              </w:rPr>
+            </w:pPr>
+            <w:r>
+              <w:rPr>
+                <w:sz w:val="26"/>
+                <w:szCs w:val="26"/>
+              </w:rPr>
+              <w:t>TIMESTAMPTZ</w:t>
+            </w:r>
+          </w:p>
+        </w:tc>
+        <w:tc>
+          <w:tcPr>
+            <w:tcW w:w="0" w:type="auto"/>
+            <w:hideMark/>
+          </w:tcPr>
+          <w:p>
+            <w:pPr>
+              <w:pStyle w:val="NormalWeb"/>
+              <w:rPr>
+                <w:sz w:val="26"/>
+                <w:szCs w:val="26"/>
+              </w:rPr>
+            </w:pPr>
+            <w:r>
+              <w:rPr>
+                <w:sz w:val="26"/>
+                <w:szCs w:val="26"/>
+              </w:rPr>
+              <w:t>Thời điểm tạo bản ghi.</w:t>
+            </w:r>
+          </w:p>
+        </w:tc>
+      </w:tr>
+      <w:tr>
+        <w:tc>
+          <w:tcPr>
+            <w:tcW w:w="0" w:type="auto"/>
+            <w:hideMark/>
+          </w:tcPr>
+          <w:p>
+            <w:pPr>
+              <w:pStyle w:val="NormalWeb"/>
+              <w:rPr>
+                <w:sz w:val="26"/>
+                <w:szCs w:val="26"/>
+              </w:rPr>
+            </w:pPr>
+            <w:r>
+              <w:rPr>
+                <w:rStyle w:val="HTMLCode"/>
+                <w:rFonts w:ascii="Times New Roman" w:hAnsi="Times New Roman" w:cs="Times New Roman"/>
+                <w:sz w:val="26"/>
+                <w:szCs w:val="26"/>
+              </w:rPr>
+              <w:t>updated_at</w:t>
+            </w:r>
+          </w:p>
+        </w:tc>
+        <w:tc>
+          <w:tcPr>
+            <w:tcW w:w="0" w:type="auto"/>
+            <w:hideMark/>
+          </w:tcPr>
+          <w:p>
+            <w:pPr>
+              <w:pStyle w:val="NormalWeb"/>
+              <w:rPr>
+                <w:sz w:val="26"/>
+                <w:szCs w:val="26"/>
+              </w:rPr>
+            </w:pPr>
+            <w:r>
+              <w:rPr>
+                <w:sz w:val="26"/>
+                <w:szCs w:val="26"/>
+              </w:rPr>
+              <w:t>TIMESTAMPTZ</w:t>
+            </w:r>
+          </w:p>
+        </w:tc>
+        <w:tc>
+          <w:tcPr>
+            <w:tcW w:w="0" w:type="auto"/>
+            <w:hideMark/>
+          </w:tcPr>
+          <w:p>
+            <w:pPr>
+              <w:pStyle w:val="NormalWeb"/>
+              <w:rPr>
+                <w:sz w:val="26"/>
+                <w:szCs w:val="26"/>
+              </w:rPr>
+            </w:pPr>
+            <w:r>
+              <w:rPr>
+                <w:sz w:val="26"/>
+                <w:szCs w:val="26"/>
+              </w:rPr>
+              <w:t>Thời điểm cập nhật bản ghi.</w:t>
+            </w:r>
+          </w:p>
+        </w:tc>
+      </w:tr>
+    </w:tbl>
+    <w:p>
+      <w:pPr>
+        <w:rPr>
+          <w:rFonts w:cs="Times New Roman"/>
+          <w:szCs w:val="26"/>
+        </w:rPr>
+      </w:pPr>
+    </w:p>
+    <w:p>
+      <w:pPr>
+        <w:pStyle w:val="Heading2"/>
         <w:rPr>
           <w:rFonts w:ascii="Times New Roman" w:hAnsi="Times New Roman" w:cs="Times New Roman"/>
         </w:rPr>
@@ -12810,6 +13882,7 @@
                 <w:sz w:val="26"/>
                 <w:szCs w:val="26"/>
               </w:rPr>
+              <w:lastRenderedPageBreak/>
               <w:t>id</w:t>
             </w:r>
           </w:p>
@@ -13770,11 +14843,13 @@
       <w:pPr>
         <w:pStyle w:val="Heading2"/>
         <w:rPr>
-          <w:rFonts w:hint="eastAsia"/>
+          <w:rFonts w:ascii="Times New Roman" w:hAnsi="Times New Roman" w:cs="Times New Roman"/>
         </w:rPr>
       </w:pPr>
       <w:r>
-        <w:lastRenderedPageBreak/>
+        <w:rPr>
+          <w:rFonts w:ascii="Times New Roman" w:hAnsi="Times New Roman" w:cs="Times New Roman"/>
+        </w:rPr>
         <w:t xml:space="preserve">Bảng </w:t>
       </w:r>
       <w:r>
@@ -13787,6 +14862,9 @@
         <w:t>commissions</w:t>
       </w:r>
       <w:r>
+        <w:rPr>
+          <w:rFonts w:ascii="Times New Roman" w:hAnsi="Times New Roman" w:cs="Times New Roman"/>
+        </w:rPr>
         <w:t xml:space="preserve"> — Hoa hồng của reseller</w:t>
       </w:r>
     </w:p>
@@ -14255,6 +15333,7 @@
                 <w:sz w:val="26"/>
                 <w:szCs w:val="26"/>
               </w:rPr>
+              <w:lastRenderedPageBreak/>
               <w:t>currency</w:t>
             </w:r>
           </w:p>
@@ -14868,7 +15947,6 @@
           <w:sz w:val="26"/>
           <w:szCs w:val="26"/>
         </w:rPr>
-        <w:lastRenderedPageBreak/>
         <w:t>commissions.reseller_id</w:t>
       </w:r>
       <w:r>
@@ -15315,6 +16393,7 @@
                 <w:sz w:val="26"/>
                 <w:szCs w:val="26"/>
               </w:rPr>
+              <w:lastRenderedPageBreak/>
               <w:t>total_amount</w:t>
             </w:r>
           </w:p>
@@ -16203,7 +17282,6 @@
                 <w:sz w:val="26"/>
                 <w:szCs w:val="26"/>
               </w:rPr>
-              <w:lastRenderedPageBreak/>
               <w:t>payout_id</w:t>
             </w:r>
           </w:p>
@@ -16571,6 +17649,7 @@
           <w:rFonts w:cs="Times New Roman"/>
           <w:szCs w:val="26"/>
         </w:rPr>
+        <w:lastRenderedPageBreak/>
         <w:t>Giả sử một reseller có ba khoản hoa hồng là 100.000, 150.000 và 200.000 đồng. Đợt chi trả có tổng 450.000 đồng, nhưng hệ thống vẫn cần biết chính xác khoản nào đã được đưa vào đợt đó.</w:t>
       </w:r>
     </w:p>
@@ -17037,7 +18116,6 @@
                 <w:color w:val="auto"/>
                 <w:szCs w:val="26"/>
               </w:rPr>
-              <w:lastRenderedPageBreak/>
               <w:t>campaign_id</w:t>
             </w:r>
           </w:p>
@@ -17438,6 +18516,7 @@
                 <w:color w:val="auto"/>
                 <w:szCs w:val="26"/>
               </w:rPr>
+              <w:lastRenderedPageBreak/>
               <w:t>media_url</w:t>
             </w:r>
           </w:p>
@@ -18262,7 +19341,6 @@
           <w:rFonts w:cs="Times New Roman"/>
           <w:szCs w:val="26"/>
         </w:rPr>
-        <w:lastRenderedPageBreak/>
         <w:t>Ví dụ trên chỉ minh họa một cấu trúc khả thi; SQL hiện tại chưa bắt buộc các khóa JSON bên trong phải có chính xác tên như vậy.</w:t>
       </w:r>
     </w:p>
@@ -18485,18 +19563,7 @@
                 <w:sz w:val="26"/>
                 <w:szCs w:val="26"/>
               </w:rPr>
-              <w:t>Ý nghĩa và ràng bu</w:t>
-            </w:r>
-            <w:bookmarkStart w:id="0" w:name="_GoBack"/>
-            <w:bookmarkEnd w:id="0"/>
-            <w:r>
-              <w:rPr>
-                <w:b/>
-                <w:bCs/>
-                <w:sz w:val="26"/>
-                <w:szCs w:val="26"/>
-              </w:rPr>
-              <w:t>ộc</w:t>
+              <w:t>Ý nghĩa và ràng buộc</w:t>
             </w:r>
           </w:p>
         </w:tc>
@@ -18592,6 +19659,7 @@
                 <w:sz w:val="26"/>
                 <w:szCs w:val="26"/>
               </w:rPr>
+              <w:lastRenderedPageBreak/>
               <w:t>merchant_id</w:t>
             </w:r>
           </w:p>
@@ -19237,7 +20305,7 @@
           <w:rPr>
             <w:noProof/>
           </w:rPr>
-          <w:t>15</w:t>
+          <w:t>17</w:t>
         </w:r>
         <w:r>
           <w:rPr>
@@ -21106,6 +22174,36 @@
     <w:abstractNumId w:val="10"/>
   </w:num>
   <w:num w:numId="19">
+    <w:abstractNumId w:val="6"/>
+    <w:lvlOverride w:ilvl="0">
+      <w:startOverride w:val="1"/>
+    </w:lvlOverride>
+    <w:lvlOverride w:ilvl="1">
+      <w:startOverride w:val="1"/>
+    </w:lvlOverride>
+    <w:lvlOverride w:ilvl="2">
+      <w:startOverride w:val="1"/>
+    </w:lvlOverride>
+    <w:lvlOverride w:ilvl="3">
+      <w:startOverride w:val="1"/>
+    </w:lvlOverride>
+    <w:lvlOverride w:ilvl="4">
+      <w:startOverride w:val="1"/>
+    </w:lvlOverride>
+    <w:lvlOverride w:ilvl="5">
+      <w:startOverride w:val="1"/>
+    </w:lvlOverride>
+    <w:lvlOverride w:ilvl="6">
+      <w:startOverride w:val="1"/>
+    </w:lvlOverride>
+    <w:lvlOverride w:ilvl="7">
+      <w:startOverride w:val="1"/>
+    </w:lvlOverride>
+    <w:lvlOverride w:ilvl="8">
+      <w:startOverride w:val="1"/>
+    </w:lvlOverride>
+  </w:num>
+  <w:num w:numId="20">
     <w:abstractNumId w:val="6"/>
     <w:lvlOverride w:ilvl="0">
       <w:startOverride w:val="1"/>
@@ -33202,7 +34300,7 @@
 </file>
 
 <file path=customXml/itemProps1.xml><?xml version="1.0" encoding="utf-8"?>
-<ds:datastoreItem xmlns:ds="http://schemas.openxmlformats.org/officeDocument/2006/customXml" ds:itemID="{5422B887-D38F-483D-848C-3BEAFF8F2025}">
+<ds:datastoreItem xmlns:ds="http://schemas.openxmlformats.org/officeDocument/2006/customXml" ds:itemID="{D034D5F2-E25F-496A-8AEA-C6D7CE0C3ECF}">
   <ds:schemaRefs>
     <ds:schemaRef ds:uri="http://schemas.openxmlformats.org/officeDocument/2006/bibliography"/>
   </ds:schemaRefs>

</xml_diff>